<commit_message>
Add GitLab profile link to CV (EN and VI) and regenerate build outputs
</commit_message>
<xml_diff>
--- a/cv-fullstack/outputs/cv-fullstack-en.docx
+++ b/cv-fullstack/outputs/cv-fullstack-en.docx
@@ -67,6 +67,17 @@
           <w:rPr>
             <w:rStyle w:val="Hyperlink"/>
           </w:rPr>
+          <w:t xml:space="preserve">gitlab.com/tranconcoder</w:t>
+        </w:r>
+      </w:hyperlink>
+      <w:r>
+        <w:br/>
+      </w:r>
+      <w:hyperlink r:id="rId12">
+        <w:r>
+          <w:rPr>
+            <w:rStyle w:val="Hyperlink"/>
+          </w:rPr>
           <w:t xml:space="preserve">portfolio.trancondev.site</w:t>
         </w:r>
       </w:hyperlink>
@@ -419,7 +430,7 @@
       <w:r>
         <w:t xml:space="preserve"> </w:t>
       </w:r>
-      <w:hyperlink r:id="rId12">
+      <w:hyperlink r:id="rId13">
         <w:r>
           <w:rPr>
             <w:rStyle w:val="Hyperlink"/>

</xml_diff>